<commit_message>
feat: small code fixes and updated report
</commit_message>
<xml_diff>
--- a/Lab01/2024-SE-31.docx
+++ b/Lab01/2024-SE-31.docx
@@ -197,17 +197,8 @@
                 <w:sz w:val="24"/>
                 <w:szCs w:val="24"/>
               </w:rPr>
-              <w:t xml:space="preserve">Sheikh </w:t>
+              <w:t>Sheikh Haseeb-ur-Rehman</w:t>
             </w:r>
-            <w:proofErr w:type="spellStart"/>
-            <w:r>
-              <w:rPr>
-                <w:sz w:val="24"/>
-                <w:szCs w:val="24"/>
-              </w:rPr>
-              <w:t>Haseeb-ur-Rehman</w:t>
-            </w:r>
-            <w:proofErr w:type="spellEnd"/>
           </w:p>
         </w:tc>
       </w:tr>
@@ -471,7 +462,7 @@
                 <w:sz w:val="24"/>
                 <w:szCs w:val="24"/>
               </w:rPr>
-              <w:t>October 23, 2026</w:t>
+              <w:t>October 22, 2026</w:t>
             </w:r>
           </w:p>
         </w:tc>
@@ -583,9 +574,6 @@
       <w:pPr>
         <w:keepNext/>
         <w:keepLines/>
-        <w:pBdr>
-          <w:left w:val="single" w:sz="18" w:space="8" w:color="1B4B43"/>
-        </w:pBdr>
         <w:shd w:val="clear" w:color="auto" w:fill="F4F6F4"/>
         <w:spacing w:before="60" w:line="300" w:lineRule="auto"/>
         <w:ind w:left="220" w:right="100"/>
@@ -603,9 +591,6 @@
       <w:pPr>
         <w:keepNext/>
         <w:keepLines/>
-        <w:pBdr>
-          <w:left w:val="single" w:sz="18" w:space="8" w:color="1B4B43"/>
-        </w:pBdr>
         <w:shd w:val="clear" w:color="auto" w:fill="F4F6F4"/>
         <w:spacing w:after="60" w:line="300" w:lineRule="auto"/>
         <w:ind w:left="220" w:right="100"/>
@@ -1157,14 +1142,11 @@
         <w:jc w:val="center"/>
       </w:pPr>
       <w:r>
-        <w:rPr>
-          <w:noProof/>
-        </w:rPr>
         <w:drawing>
-          <wp:inline distT="0" distB="0" distL="0" distR="0" wp14:anchorId="6CB38858" wp14:editId="6CB38859">
-            <wp:extent cx="4848225" cy="3209925"/>
-            <wp:effectExtent l="0" t="0" r="0" b="0"/>
-            <wp:docPr id="1926069328" name="Figure 5" descr="Exercise 1 code" title="Figure 5"/>
+          <wp:inline distT="0" distB="0" distL="0" distR="0" wp14:anchorId="72E0F380" wp14:editId="587C523A">
+            <wp:extent cx="6172200" cy="2244090"/>
+            <wp:effectExtent l="0" t="0" r="0" b="3810"/>
+            <wp:docPr id="296263011" name="Picture 1"/>
             <wp:cNvGraphicFramePr>
               <a:graphicFrameLocks xmlns:a="http://schemas.openxmlformats.org/drawingml/2006/main" noChangeAspect="1"/>
             </wp:cNvGraphicFramePr>
@@ -1172,22 +1154,19 @@
               <a:graphicData uri="http://schemas.openxmlformats.org/drawingml/2006/picture">
                 <pic:pic xmlns:pic="http://schemas.openxmlformats.org/drawingml/2006/picture">
                   <pic:nvPicPr>
-                    <pic:cNvPr id="0" name=""/>
-                    <pic:cNvPicPr>
-                      <a:picLocks noChangeAspect="1" noChangeArrowheads="1"/>
-                    </pic:cNvPicPr>
+                    <pic:cNvPr id="296263011" name=""/>
+                    <pic:cNvPicPr/>
                   </pic:nvPicPr>
                   <pic:blipFill>
                     <a:blip r:embed="rId14"/>
-                    <a:srcRect/>
                     <a:stretch>
                       <a:fillRect/>
                     </a:stretch>
                   </pic:blipFill>
-                  <pic:spPr bwMode="auto">
+                  <pic:spPr>
                     <a:xfrm>
                       <a:off x="0" y="0"/>
-                      <a:ext cx="4848225" cy="3209925"/>
+                      <a:ext cx="6172200" cy="2244090"/>
                     </a:xfrm>
                     <a:prstGeom prst="rect">
                       <a:avLst/>
@@ -1369,14 +1348,11 @@
         <w:jc w:val="center"/>
       </w:pPr>
       <w:r>
-        <w:rPr>
-          <w:noProof/>
-        </w:rPr>
         <w:drawing>
-          <wp:inline distT="0" distB="0" distL="0" distR="0" wp14:anchorId="6CB3885C" wp14:editId="6CB3885D">
-            <wp:extent cx="4848225" cy="1266825"/>
+          <wp:inline distT="0" distB="0" distL="0" distR="0" wp14:anchorId="04ED49CB" wp14:editId="7C93C264">
+            <wp:extent cx="6172200" cy="1910715"/>
             <wp:effectExtent l="0" t="0" r="0" b="0"/>
-            <wp:docPr id="1596083592" name="Figure 7" descr="Exercise 2 code" title="Figure 7"/>
+            <wp:docPr id="380467189" name="Picture 1"/>
             <wp:cNvGraphicFramePr>
               <a:graphicFrameLocks xmlns:a="http://schemas.openxmlformats.org/drawingml/2006/main" noChangeAspect="1"/>
             </wp:cNvGraphicFramePr>
@@ -1384,22 +1360,19 @@
               <a:graphicData uri="http://schemas.openxmlformats.org/drawingml/2006/picture">
                 <pic:pic xmlns:pic="http://schemas.openxmlformats.org/drawingml/2006/picture">
                   <pic:nvPicPr>
-                    <pic:cNvPr id="0" name=""/>
-                    <pic:cNvPicPr>
-                      <a:picLocks noChangeAspect="1" noChangeArrowheads="1"/>
-                    </pic:cNvPicPr>
+                    <pic:cNvPr id="380467189" name=""/>
+                    <pic:cNvPicPr/>
                   </pic:nvPicPr>
                   <pic:blipFill>
                     <a:blip r:embed="rId16"/>
-                    <a:srcRect/>
                     <a:stretch>
                       <a:fillRect/>
                     </a:stretch>
                   </pic:blipFill>
-                  <pic:spPr bwMode="auto">
+                  <pic:spPr>
                     <a:xfrm>
                       <a:off x="0" y="0"/>
-                      <a:ext cx="4848225" cy="1266825"/>
+                      <a:ext cx="6172200" cy="1910715"/>
                     </a:xfrm>
                     <a:prstGeom prst="rect">
                       <a:avLst/>
@@ -1597,14 +1570,11 @@
         <w:jc w:val="center"/>
       </w:pPr>
       <w:r>
-        <w:rPr>
-          <w:noProof/>
-        </w:rPr>
         <w:drawing>
-          <wp:inline distT="0" distB="0" distL="0" distR="0" wp14:anchorId="6CB38860" wp14:editId="6CB38861">
-            <wp:extent cx="4848225" cy="1152525"/>
-            <wp:effectExtent l="0" t="0" r="0" b="0"/>
-            <wp:docPr id="1113315611" name="Figure 9" descr="Exercise 3 code" title="Figure 9"/>
+          <wp:inline distT="0" distB="0" distL="0" distR="0" wp14:anchorId="714663EB" wp14:editId="1AA92379">
+            <wp:extent cx="6172200" cy="2109470"/>
+            <wp:effectExtent l="0" t="0" r="0" b="5080"/>
+            <wp:docPr id="1816147364" name="Picture 1"/>
             <wp:cNvGraphicFramePr>
               <a:graphicFrameLocks xmlns:a="http://schemas.openxmlformats.org/drawingml/2006/main" noChangeAspect="1"/>
             </wp:cNvGraphicFramePr>
@@ -1612,22 +1582,19 @@
               <a:graphicData uri="http://schemas.openxmlformats.org/drawingml/2006/picture">
                 <pic:pic xmlns:pic="http://schemas.openxmlformats.org/drawingml/2006/picture">
                   <pic:nvPicPr>
-                    <pic:cNvPr id="0" name=""/>
-                    <pic:cNvPicPr>
-                      <a:picLocks noChangeAspect="1" noChangeArrowheads="1"/>
-                    </pic:cNvPicPr>
+                    <pic:cNvPr id="1816147364" name=""/>
+                    <pic:cNvPicPr/>
                   </pic:nvPicPr>
                   <pic:blipFill>
                     <a:blip r:embed="rId18"/>
-                    <a:srcRect/>
                     <a:stretch>
                       <a:fillRect/>
                     </a:stretch>
                   </pic:blipFill>
-                  <pic:spPr bwMode="auto">
+                  <pic:spPr>
                     <a:xfrm>
                       <a:off x="0" y="0"/>
-                      <a:ext cx="4848225" cy="1152525"/>
+                      <a:ext cx="6172200" cy="2109470"/>
                     </a:xfrm>
                     <a:prstGeom prst="rect">
                       <a:avLst/>
@@ -1669,6 +1636,7 @@
           <w:sz w:val="18"/>
           <w:szCs w:val="18"/>
         </w:rPr>
+        <w:lastRenderedPageBreak/>
         <w:t xml:space="preserve">▸ </w:t>
       </w:r>
       <w:r>
@@ -1761,7 +1729,6 @@
           <w:sz w:val="16"/>
           <w:szCs w:val="16"/>
         </w:rPr>
-        <w:lastRenderedPageBreak/>
         <w:t xml:space="preserve">■ </w:t>
       </w:r>
       <w:r>
@@ -1809,14 +1776,11 @@
         <w:jc w:val="center"/>
       </w:pPr>
       <w:r>
-        <w:rPr>
-          <w:noProof/>
-        </w:rPr>
         <w:drawing>
-          <wp:inline distT="0" distB="0" distL="0" distR="0" wp14:anchorId="6CB38864" wp14:editId="6CB38865">
-            <wp:extent cx="4848225" cy="1009650"/>
-            <wp:effectExtent l="0" t="0" r="0" b="0"/>
-            <wp:docPr id="1289223558" name="Figure 11" descr="Exercise 4 code" title="Figure 11"/>
+          <wp:inline distT="0" distB="0" distL="0" distR="0" wp14:anchorId="0E54DCAC" wp14:editId="190F5EA5">
+            <wp:extent cx="6172200" cy="1826895"/>
+            <wp:effectExtent l="0" t="0" r="0" b="1905"/>
+            <wp:docPr id="752827519" name="Picture 1"/>
             <wp:cNvGraphicFramePr>
               <a:graphicFrameLocks xmlns:a="http://schemas.openxmlformats.org/drawingml/2006/main" noChangeAspect="1"/>
             </wp:cNvGraphicFramePr>
@@ -1824,22 +1788,19 @@
               <a:graphicData uri="http://schemas.openxmlformats.org/drawingml/2006/picture">
                 <pic:pic xmlns:pic="http://schemas.openxmlformats.org/drawingml/2006/picture">
                   <pic:nvPicPr>
-                    <pic:cNvPr id="0" name=""/>
-                    <pic:cNvPicPr>
-                      <a:picLocks noChangeAspect="1" noChangeArrowheads="1"/>
-                    </pic:cNvPicPr>
+                    <pic:cNvPr id="752827519" name=""/>
+                    <pic:cNvPicPr/>
                   </pic:nvPicPr>
                   <pic:blipFill>
                     <a:blip r:embed="rId20"/>
-                    <a:srcRect/>
                     <a:stretch>
                       <a:fillRect/>
                     </a:stretch>
                   </pic:blipFill>
-                  <pic:spPr bwMode="auto">
+                  <pic:spPr>
                     <a:xfrm>
                       <a:off x="0" y="0"/>
-                      <a:ext cx="4848225" cy="1009650"/>
+                      <a:ext cx="6172200" cy="1826895"/>
                     </a:xfrm>
                     <a:prstGeom prst="rect">
                       <a:avLst/>
@@ -1975,6 +1936,7 @@
           <w:sz w:val="25"/>
           <w:szCs w:val="25"/>
         </w:rPr>
+        <w:lastRenderedPageBreak/>
         <w:t>Exercises 5 &amp; 6: Collections (Lists, Tuples, Dictionaries, Sets)</w:t>
       </w:r>
     </w:p>
@@ -2037,14 +1999,11 @@
         <w:jc w:val="center"/>
       </w:pPr>
       <w:r>
-        <w:rPr>
-          <w:noProof/>
-        </w:rPr>
         <w:drawing>
-          <wp:inline distT="0" distB="0" distL="0" distR="0" wp14:anchorId="6CB38868" wp14:editId="6CB38869">
-            <wp:extent cx="5943600" cy="2343669"/>
+          <wp:inline distT="0" distB="0" distL="0" distR="0" wp14:anchorId="4F8259FC" wp14:editId="1B1F8879">
+            <wp:extent cx="6172200" cy="3016250"/>
             <wp:effectExtent l="0" t="0" r="0" b="0"/>
-            <wp:docPr id="126182067" name="Figure 13" descr="Exercise 5 code" title="Figure 13"/>
+            <wp:docPr id="184070362" name="Picture 1"/>
             <wp:cNvGraphicFramePr>
               <a:graphicFrameLocks xmlns:a="http://schemas.openxmlformats.org/drawingml/2006/main" noChangeAspect="1"/>
             </wp:cNvGraphicFramePr>
@@ -2052,22 +2011,19 @@
               <a:graphicData uri="http://schemas.openxmlformats.org/drawingml/2006/picture">
                 <pic:pic xmlns:pic="http://schemas.openxmlformats.org/drawingml/2006/picture">
                   <pic:nvPicPr>
-                    <pic:cNvPr id="0" name=""/>
-                    <pic:cNvPicPr>
-                      <a:picLocks noChangeAspect="1" noChangeArrowheads="1"/>
-                    </pic:cNvPicPr>
+                    <pic:cNvPr id="184070362" name=""/>
+                    <pic:cNvPicPr/>
                   </pic:nvPicPr>
                   <pic:blipFill>
                     <a:blip r:embed="rId22"/>
-                    <a:srcRect/>
                     <a:stretch>
                       <a:fillRect/>
                     </a:stretch>
                   </pic:blipFill>
-                  <pic:spPr bwMode="auto">
+                  <pic:spPr>
                     <a:xfrm>
                       <a:off x="0" y="0"/>
-                      <a:ext cx="5943600" cy="2343669"/>
+                      <a:ext cx="6172200" cy="3016250"/>
                     </a:xfrm>
                     <a:prstGeom prst="rect">
                       <a:avLst/>
@@ -2201,7 +2157,6 @@
           <w:sz w:val="16"/>
           <w:szCs w:val="16"/>
         </w:rPr>
-        <w:lastRenderedPageBreak/>
         <w:t xml:space="preserve">■ </w:t>
       </w:r>
       <w:r>
@@ -2249,14 +2204,11 @@
         <w:jc w:val="center"/>
       </w:pPr>
       <w:r>
-        <w:rPr>
-          <w:noProof/>
-        </w:rPr>
         <w:drawing>
-          <wp:inline distT="0" distB="0" distL="0" distR="0" wp14:anchorId="6CB3886C" wp14:editId="6CB3886D">
-            <wp:extent cx="4848225" cy="1581150"/>
-            <wp:effectExtent l="0" t="0" r="0" b="0"/>
-            <wp:docPr id="1237273997" name="Figure 15" descr="Exercise 6 code" title="Figure 15"/>
+          <wp:inline distT="0" distB="0" distL="0" distR="0" wp14:anchorId="46B0B0DE" wp14:editId="46DAEF5F">
+            <wp:extent cx="6172200" cy="2264410"/>
+            <wp:effectExtent l="0" t="0" r="0" b="2540"/>
+            <wp:docPr id="1594234403" name="Picture 1"/>
             <wp:cNvGraphicFramePr>
               <a:graphicFrameLocks xmlns:a="http://schemas.openxmlformats.org/drawingml/2006/main" noChangeAspect="1"/>
             </wp:cNvGraphicFramePr>
@@ -2264,22 +2216,19 @@
               <a:graphicData uri="http://schemas.openxmlformats.org/drawingml/2006/picture">
                 <pic:pic xmlns:pic="http://schemas.openxmlformats.org/drawingml/2006/picture">
                   <pic:nvPicPr>
-                    <pic:cNvPr id="0" name=""/>
-                    <pic:cNvPicPr>
-                      <a:picLocks noChangeAspect="1" noChangeArrowheads="1"/>
-                    </pic:cNvPicPr>
+                    <pic:cNvPr id="1594234403" name=""/>
+                    <pic:cNvPicPr/>
                   </pic:nvPicPr>
                   <pic:blipFill>
                     <a:blip r:embed="rId24"/>
-                    <a:srcRect/>
                     <a:stretch>
                       <a:fillRect/>
                     </a:stretch>
                   </pic:blipFill>
-                  <pic:spPr bwMode="auto">
+                  <pic:spPr>
                     <a:xfrm>
                       <a:off x="0" y="0"/>
-                      <a:ext cx="4848225" cy="1581150"/>
+                      <a:ext cx="6172200" cy="2264410"/>
                     </a:xfrm>
                     <a:prstGeom prst="rect">
                       <a:avLst/>
@@ -2321,6 +2270,7 @@
           <w:sz w:val="18"/>
           <w:szCs w:val="18"/>
         </w:rPr>
+        <w:lastRenderedPageBreak/>
         <w:t xml:space="preserve">▸ </w:t>
       </w:r>
       <w:r>
@@ -2404,9 +2354,6 @@
     <w:p>
       <w:pPr>
         <w:keepLines/>
-        <w:pBdr>
-          <w:left w:val="single" w:sz="24" w:space="10" w:color="8B5E1F"/>
-        </w:pBdr>
         <w:shd w:val="clear" w:color="auto" w:fill="F4F6F4"/>
         <w:spacing w:before="160" w:after="200" w:line="288" w:lineRule="auto"/>
         <w:ind w:left="260" w:right="160"/>
@@ -2420,7 +2367,7 @@
         <w:t xml:space="preserve">Understanding Mutability: </w:t>
       </w:r>
       <w:r>
-        <w:t>As demonstrated in Exercise 5, a list is a mutable collection, meaning its individual items can be modified, added, or removed after creation. Conversely, a tuple is immutable, meaning its elements and size are permanently fixed once defined and cannot be changed.</w:t>
+        <w:t>As demonstrated in Exercise 5, a list is a mutable collection: its items can be reassigned, added or removed in place (for example pixels[1] = 150 and pixels.append(64)). A tuple is immutable: it does not support item assignment, so an attempt such as size[0] = 100 raises a TypeError, and its items stay fixed once the tuple is created.</w:t>
       </w:r>
     </w:p>
     <w:p>
@@ -2504,9 +2451,6 @@
       <w:pPr>
         <w:keepNext/>
         <w:keepLines/>
-        <w:pBdr>
-          <w:left w:val="single" w:sz="18" w:space="8" w:color="1B4B43"/>
-        </w:pBdr>
         <w:shd w:val="clear" w:color="auto" w:fill="F4F6F4"/>
         <w:spacing w:before="60" w:line="300" w:lineRule="auto"/>
         <w:ind w:left="220" w:right="100"/>
@@ -2517,95 +2461,24 @@
           <w:sz w:val="20"/>
           <w:szCs w:val="20"/>
         </w:rPr>
-        <w:t xml:space="preserve">pip install </w:t>
-      </w:r>
-      <w:proofErr w:type="spellStart"/>
+        <w:t>python -m pip install numpy pillow matplotlib</w:t>
+      </w:r>
+    </w:p>
+    <w:p>
+      <w:pPr>
+        <w:keepNext/>
+        <w:keepLines/>
+        <w:shd w:val="clear" w:color="auto" w:fill="F4F6F4"/>
+        <w:spacing w:line="300" w:lineRule="auto"/>
+        <w:ind w:left="220" w:right="100"/>
+      </w:pPr>
       <w:r>
         <w:rPr>
           <w:rFonts w:ascii="Consolas" w:eastAsia="Consolas" w:hAnsi="Consolas" w:cs="Consolas"/>
           <w:sz w:val="20"/>
           <w:szCs w:val="20"/>
         </w:rPr>
-        <w:t>numpy</w:t>
-      </w:r>
-      <w:proofErr w:type="spellEnd"/>
-      <w:r>
-        <w:rPr>
-          <w:rFonts w:ascii="Consolas" w:eastAsia="Consolas" w:hAnsi="Consolas" w:cs="Consolas"/>
-          <w:sz w:val="20"/>
-          <w:szCs w:val="20"/>
-        </w:rPr>
-        <w:t xml:space="preserve"> pillow matplotlib</w:t>
-      </w:r>
-    </w:p>
-    <w:p>
-      <w:pPr>
-        <w:keepNext/>
-        <w:keepLines/>
-        <w:pBdr>
-          <w:left w:val="single" w:sz="18" w:space="8" w:color="1B4B43"/>
-        </w:pBdr>
-        <w:shd w:val="clear" w:color="auto" w:fill="F4F6F4"/>
-        <w:spacing w:line="300" w:lineRule="auto"/>
-        <w:ind w:left="220" w:right="100"/>
-      </w:pPr>
-      <w:r>
-        <w:rPr>
-          <w:rFonts w:ascii="Consolas" w:eastAsia="Consolas" w:hAnsi="Consolas" w:cs="Consolas"/>
-          <w:sz w:val="20"/>
-          <w:szCs w:val="20"/>
-        </w:rPr>
-        <w:t xml:space="preserve">pip show </w:t>
-      </w:r>
-      <w:proofErr w:type="spellStart"/>
-      <w:r>
-        <w:rPr>
-          <w:rFonts w:ascii="Consolas" w:eastAsia="Consolas" w:hAnsi="Consolas" w:cs="Consolas"/>
-          <w:sz w:val="20"/>
-          <w:szCs w:val="20"/>
-        </w:rPr>
-        <w:t>numpy</w:t>
-      </w:r>
-      <w:proofErr w:type="spellEnd"/>
-    </w:p>
-    <w:p>
-      <w:pPr>
-        <w:keepNext/>
-        <w:keepLines/>
-        <w:pBdr>
-          <w:left w:val="single" w:sz="18" w:space="8" w:color="1B4B43"/>
-        </w:pBdr>
-        <w:shd w:val="clear" w:color="auto" w:fill="F4F6F4"/>
-        <w:spacing w:line="300" w:lineRule="auto"/>
-        <w:ind w:left="220" w:right="100"/>
-      </w:pPr>
-      <w:r>
-        <w:rPr>
-          <w:rFonts w:ascii="Consolas" w:eastAsia="Consolas" w:hAnsi="Consolas" w:cs="Consolas"/>
-          <w:sz w:val="20"/>
-          <w:szCs w:val="20"/>
-        </w:rPr>
-        <w:t>pip show pillow</w:t>
-      </w:r>
-    </w:p>
-    <w:p>
-      <w:pPr>
-        <w:keepNext/>
-        <w:keepLines/>
-        <w:pBdr>
-          <w:left w:val="single" w:sz="18" w:space="8" w:color="1B4B43"/>
-        </w:pBdr>
-        <w:shd w:val="clear" w:color="auto" w:fill="F4F6F4"/>
-        <w:spacing w:after="60" w:line="300" w:lineRule="auto"/>
-        <w:ind w:left="220" w:right="100"/>
-      </w:pPr>
-      <w:r>
-        <w:rPr>
-          <w:rFonts w:ascii="Consolas" w:eastAsia="Consolas" w:hAnsi="Consolas" w:cs="Consolas"/>
-          <w:sz w:val="20"/>
-          <w:szCs w:val="20"/>
-        </w:rPr>
-        <w:t>pip show matplotlib</w:t>
+        <w:t>python -m pip show numpy pillow matplotlib</w:t>
       </w:r>
     </w:p>
     <w:p>
@@ -2636,7 +2509,6 @@
           <w:sz w:val="16"/>
           <w:szCs w:val="16"/>
         </w:rPr>
-        <w:lastRenderedPageBreak/>
         <w:t xml:space="preserve">■ </w:t>
       </w:r>
       <w:r>
@@ -2713,29 +2585,7 @@
           <w:sz w:val="18"/>
           <w:szCs w:val="18"/>
         </w:rPr>
-        <w:t xml:space="preserve">Figure 17 — pip show output for </w:t>
-      </w:r>
-      <w:proofErr w:type="spellStart"/>
-      <w:r>
-        <w:rPr>
-          <w:i/>
-          <w:iCs/>
-          <w:color w:val="5B6570"/>
-          <w:sz w:val="18"/>
-          <w:szCs w:val="18"/>
-        </w:rPr>
-        <w:t>numpy</w:t>
-      </w:r>
-      <w:proofErr w:type="spellEnd"/>
-      <w:r>
-        <w:rPr>
-          <w:i/>
-          <w:iCs/>
-          <w:color w:val="5B6570"/>
-          <w:sz w:val="18"/>
-          <w:szCs w:val="18"/>
-        </w:rPr>
-        <w:t>, pillow, matplotlib</w:t>
+        <w:t>Figure 17 — pip show output for numpy, pillow, matplotlib</w:t>
       </w:r>
     </w:p>
     <w:p>
@@ -2750,6 +2600,7 @@
           <w:sz w:val="16"/>
           <w:szCs w:val="16"/>
         </w:rPr>
+        <w:lastRenderedPageBreak/>
         <w:t xml:space="preserve">■ </w:t>
       </w:r>
       <w:r>
@@ -2868,9 +2719,6 @@
     <w:p>
       <w:pPr>
         <w:keepLines/>
-        <w:pBdr>
-          <w:left w:val="single" w:sz="24" w:space="10" w:color="8B5E1F"/>
-        </w:pBdr>
         <w:shd w:val="clear" w:color="auto" w:fill="F4F6F4"/>
         <w:spacing w:before="160" w:after="200" w:line="288" w:lineRule="auto"/>
         <w:ind w:left="260" w:right="160"/>
@@ -2932,9 +2780,6 @@
       <w:pPr>
         <w:keepNext/>
         <w:keepLines/>
-        <w:pBdr>
-          <w:left w:val="single" w:sz="18" w:space="8" w:color="1B4B43"/>
-        </w:pBdr>
         <w:shd w:val="clear" w:color="auto" w:fill="F4F6F4"/>
         <w:spacing w:before="60" w:line="300" w:lineRule="auto"/>
         <w:ind w:left="220" w:right="100"/>
@@ -2956,25 +2801,54 @@
           <w:sz w:val="20"/>
           <w:szCs w:val="20"/>
         </w:rPr>
-        <w:t xml:space="preserve"> </w:t>
-      </w:r>
-      <w:proofErr w:type="spellStart"/>
+        <w:t xml:space="preserve"> numpy </w:t>
+      </w:r>
+      <w:r>
+        <w:rPr>
+          <w:rFonts w:ascii="Consolas" w:eastAsia="Consolas" w:hAnsi="Consolas" w:cs="Consolas"/>
+          <w:b/>
+          <w:bCs/>
+          <w:color w:val="1B4B43"/>
+          <w:sz w:val="20"/>
+          <w:szCs w:val="20"/>
+        </w:rPr>
+        <w:t>as</w:t>
+      </w:r>
       <w:r>
         <w:rPr>
           <w:rFonts w:ascii="Consolas" w:eastAsia="Consolas" w:hAnsi="Consolas" w:cs="Consolas"/>
           <w:sz w:val="20"/>
           <w:szCs w:val="20"/>
         </w:rPr>
-        <w:t>numpy</w:t>
-      </w:r>
-      <w:proofErr w:type="spellEnd"/>
+        <w:t xml:space="preserve"> np</w:t>
+      </w:r>
+    </w:p>
+    <w:p>
+      <w:pPr>
+        <w:keepNext/>
+        <w:keepLines/>
+        <w:shd w:val="clear" w:color="auto" w:fill="F4F6F4"/>
+        <w:spacing w:line="300" w:lineRule="auto"/>
+        <w:ind w:left="220" w:right="100"/>
+      </w:pPr>
+      <w:r>
+        <w:rPr>
+          <w:rFonts w:ascii="Consolas" w:eastAsia="Consolas" w:hAnsi="Consolas" w:cs="Consolas"/>
+          <w:b/>
+          <w:bCs/>
+          <w:color w:val="1B4B43"/>
+          <w:sz w:val="20"/>
+          <w:szCs w:val="20"/>
+        </w:rPr>
+        <w:t>from</w:t>
+      </w:r>
       <w:r>
         <w:rPr>
           <w:rFonts w:ascii="Consolas" w:eastAsia="Consolas" w:hAnsi="Consolas" w:cs="Consolas"/>
           <w:sz w:val="20"/>
           <w:szCs w:val="20"/>
         </w:rPr>
-        <w:t xml:space="preserve"> </w:t>
+        <w:t xml:space="preserve"> PIL </w:t>
       </w:r>
       <w:r>
         <w:rPr>
@@ -2985,7 +2859,7 @@
           <w:sz w:val="20"/>
           <w:szCs w:val="20"/>
         </w:rPr>
-        <w:t>as</w:t>
+        <w:t>import</w:t>
       </w:r>
       <w:r>
         <w:rPr>
@@ -2993,18 +2867,15 @@
           <w:sz w:val="20"/>
           <w:szCs w:val="20"/>
         </w:rPr>
-        <w:t xml:space="preserve"> np</w:t>
-      </w:r>
-    </w:p>
-    <w:p>
-      <w:pPr>
-        <w:keepNext/>
-        <w:keepLines/>
-        <w:pBdr>
-          <w:left w:val="single" w:sz="18" w:space="8" w:color="1B4B43"/>
-        </w:pBdr>
+        <w:t xml:space="preserve"> Image</w:t>
+      </w:r>
+    </w:p>
+    <w:p>
+      <w:pPr>
+        <w:keepNext/>
+        <w:keepLines/>
         <w:shd w:val="clear" w:color="auto" w:fill="F4F6F4"/>
-        <w:spacing w:line="300" w:lineRule="auto"/>
+        <w:spacing w:after="60" w:line="300" w:lineRule="auto"/>
         <w:ind w:left="220" w:right="100"/>
       </w:pPr>
       <w:r>
@@ -3016,7 +2887,7 @@
           <w:sz w:val="20"/>
           <w:szCs w:val="20"/>
         </w:rPr>
-        <w:t>from</w:t>
+        <w:t>import</w:t>
       </w:r>
       <w:r>
         <w:rPr>
@@ -3024,7 +2895,7 @@
           <w:sz w:val="20"/>
           <w:szCs w:val="20"/>
         </w:rPr>
-        <w:t xml:space="preserve"> PIL </w:t>
+        <w:t xml:space="preserve"> matplotlib.pyplot </w:t>
       </w:r>
       <w:r>
         <w:rPr>
@@ -3035,7 +2906,7 @@
           <w:sz w:val="20"/>
           <w:szCs w:val="20"/>
         </w:rPr>
-        <w:t>import</w:t>
+        <w:t>as</w:t>
       </w:r>
       <w:r>
         <w:rPr>
@@ -3043,88 +2914,8 @@
           <w:sz w:val="20"/>
           <w:szCs w:val="20"/>
         </w:rPr>
-        <w:t xml:space="preserve"> Image</w:t>
-      </w:r>
-    </w:p>
-    <w:p>
-      <w:pPr>
-        <w:keepNext/>
-        <w:keepLines/>
-        <w:pBdr>
-          <w:left w:val="single" w:sz="18" w:space="8" w:color="1B4B43"/>
-        </w:pBdr>
-        <w:shd w:val="clear" w:color="auto" w:fill="F4F6F4"/>
-        <w:spacing w:after="60" w:line="300" w:lineRule="auto"/>
-        <w:ind w:left="220" w:right="100"/>
-      </w:pPr>
-      <w:r>
-        <w:rPr>
-          <w:rFonts w:ascii="Consolas" w:eastAsia="Consolas" w:hAnsi="Consolas" w:cs="Consolas"/>
-          <w:b/>
-          <w:bCs/>
-          <w:color w:val="1B4B43"/>
-          <w:sz w:val="20"/>
-          <w:szCs w:val="20"/>
-        </w:rPr>
-        <w:t>import</w:t>
-      </w:r>
-      <w:r>
-        <w:rPr>
-          <w:rFonts w:ascii="Consolas" w:eastAsia="Consolas" w:hAnsi="Consolas" w:cs="Consolas"/>
-          <w:sz w:val="20"/>
-          <w:szCs w:val="20"/>
-        </w:rPr>
-        <w:t xml:space="preserve"> </w:t>
-      </w:r>
-      <w:proofErr w:type="spellStart"/>
-      <w:proofErr w:type="gramStart"/>
-      <w:r>
-        <w:rPr>
-          <w:rFonts w:ascii="Consolas" w:eastAsia="Consolas" w:hAnsi="Consolas" w:cs="Consolas"/>
-          <w:sz w:val="20"/>
-          <w:szCs w:val="20"/>
-        </w:rPr>
-        <w:t>matplotlib.pyplot</w:t>
-      </w:r>
-      <w:proofErr w:type="spellEnd"/>
-      <w:proofErr w:type="gramEnd"/>
-      <w:r>
-        <w:rPr>
-          <w:rFonts w:ascii="Consolas" w:eastAsia="Consolas" w:hAnsi="Consolas" w:cs="Consolas"/>
-          <w:sz w:val="20"/>
-          <w:szCs w:val="20"/>
-        </w:rPr>
-        <w:t xml:space="preserve"> </w:t>
-      </w:r>
-      <w:r>
-        <w:rPr>
-          <w:rFonts w:ascii="Consolas" w:eastAsia="Consolas" w:hAnsi="Consolas" w:cs="Consolas"/>
-          <w:b/>
-          <w:bCs/>
-          <w:color w:val="1B4B43"/>
-          <w:sz w:val="20"/>
-          <w:szCs w:val="20"/>
-        </w:rPr>
-        <w:t>as</w:t>
-      </w:r>
-      <w:r>
-        <w:rPr>
-          <w:rFonts w:ascii="Consolas" w:eastAsia="Consolas" w:hAnsi="Consolas" w:cs="Consolas"/>
-          <w:sz w:val="20"/>
-          <w:szCs w:val="20"/>
-        </w:rPr>
-        <w:t xml:space="preserve"> </w:t>
-      </w:r>
-      <w:proofErr w:type="spellStart"/>
-      <w:r>
-        <w:rPr>
-          <w:rFonts w:ascii="Consolas" w:eastAsia="Consolas" w:hAnsi="Consolas" w:cs="Consolas"/>
-          <w:sz w:val="20"/>
-          <w:szCs w:val="20"/>
-        </w:rPr>
-        <w:t>plt</w:t>
-      </w:r>
-      <w:proofErr w:type="spellEnd"/>
+        <w:t xml:space="preserve"> plt</w:t>
+      </w:r>
     </w:p>
     <w:p>
       <w:pPr>
@@ -3296,7 +3087,7 @@
         <w:sz w:val="16"/>
         <w:szCs w:val="16"/>
       </w:rPr>
-      <w:t>Lab01.py</w:t>
+      <w:t>Lab Task #01</w:t>
     </w:r>
     <w:r>
       <w:rPr>

</xml_diff>